<commit_message>
docs: Actualizar portada con enlace del repositorio
</commit_message>
<xml_diff>
--- a/EXAMEN-PARCIAL-I/Evidencias/Evidencia_Cajero_GloriaPunay.docx
+++ b/EXAMEN-PARCIAL-I/Evidencias/Evidencia_Cajero_GloriaPunay.docx
@@ -86,15 +86,7 @@
           <w:kern w:val="0"/>
           <w14:ligatures w14:val="none"/>
         </w:rPr>
-        <w:t xml:space="preserve">ING. </w:t>
-      </w:r>
-      <w:r>
-        <w:rPr>
-          <w:rFonts w:ascii="Times New Roman" w:eastAsia="MS Mincho" w:hAnsi="Times New Roman" w:cs="Times New Roman"/>
-          <w:kern w:val="0"/>
-          <w14:ligatures w14:val="none"/>
-        </w:rPr>
-        <w:t>DAVID ÁLVAREZ</w:t>
+        <w:t>ING. DAVID ÁLVAREZ</w:t>
       </w:r>
     </w:p>
     <w:p>
@@ -445,8 +437,126 @@
           <w:lang w:val="es-ES"/>
           <w14:ligatures w14:val="none"/>
         </w:rPr>
-        <w:t xml:space="preserve">                C</w:t>
-      </w:r>
+        <w:t xml:space="preserve">            </w:t>
+      </w:r>
+    </w:p>
+    <w:p>
+      <w:pPr>
+        <w:tabs>
+          <w:tab w:val="left" w:pos="720"/>
+          <w:tab w:val="left" w:pos="1440"/>
+          <w:tab w:val="left" w:pos="2160"/>
+          <w:tab w:val="left" w:pos="2880"/>
+          <w:tab w:val="left" w:pos="3600"/>
+          <w:tab w:val="left" w:pos="4320"/>
+          <w:tab w:val="center" w:pos="5040"/>
+          <w:tab w:val="left" w:pos="5760"/>
+          <w:tab w:val="left" w:pos="6480"/>
+          <w:tab w:val="left" w:pos="7200"/>
+          <w:tab w:val="left" w:pos="7920"/>
+          <w:tab w:val="left" w:pos="8640"/>
+        </w:tabs>
+        <w:spacing w:after="0" w:line="480" w:lineRule="auto"/>
+        <w:rPr>
+          <w:rFonts w:ascii="Times New Roman" w:eastAsia="MS Mincho" w:hAnsi="Times New Roman" w:cs="Times New Roman"/>
+          <w:kern w:val="0"/>
+          <w:lang w:val="es-ES"/>
+          <w14:ligatures w14:val="none"/>
+        </w:rPr>
+      </w:pPr>
+      <w:r>
+        <w:rPr>
+          <w:rFonts w:ascii="Times New Roman" w:eastAsia="MS Mincho" w:hAnsi="Times New Roman" w:cs="Times New Roman"/>
+          <w:kern w:val="0"/>
+          <w:lang w:val="es-ES"/>
+          <w14:ligatures w14:val="none"/>
+        </w:rPr>
+        <w:tab/>
+      </w:r>
+      <w:proofErr w:type="gramStart"/>
+      <w:r>
+        <w:rPr>
+          <w:rFonts w:ascii="Times New Roman" w:eastAsia="MS Mincho" w:hAnsi="Times New Roman" w:cs="Times New Roman"/>
+          <w:kern w:val="0"/>
+          <w:lang w:val="es-ES"/>
+          <w14:ligatures w14:val="none"/>
+        </w:rPr>
+        <w:t>LINK</w:t>
+      </w:r>
+      <w:proofErr w:type="gramEnd"/>
+      <w:r>
+        <w:rPr>
+          <w:rFonts w:ascii="Times New Roman" w:eastAsia="MS Mincho" w:hAnsi="Times New Roman" w:cs="Times New Roman"/>
+          <w:kern w:val="0"/>
+          <w:lang w:val="es-ES"/>
+          <w14:ligatures w14:val="none"/>
+        </w:rPr>
+        <w:t xml:space="preserve"> GITHUB:</w:t>
+      </w:r>
+    </w:p>
+    <w:p>
+      <w:pPr>
+        <w:tabs>
+          <w:tab w:val="left" w:pos="720"/>
+          <w:tab w:val="left" w:pos="1440"/>
+          <w:tab w:val="left" w:pos="2160"/>
+          <w:tab w:val="left" w:pos="2880"/>
+          <w:tab w:val="left" w:pos="3600"/>
+          <w:tab w:val="left" w:pos="4320"/>
+          <w:tab w:val="center" w:pos="5040"/>
+          <w:tab w:val="left" w:pos="5760"/>
+          <w:tab w:val="left" w:pos="6480"/>
+          <w:tab w:val="left" w:pos="7200"/>
+          <w:tab w:val="left" w:pos="7920"/>
+          <w:tab w:val="left" w:pos="8640"/>
+        </w:tabs>
+        <w:spacing w:after="0" w:line="480" w:lineRule="auto"/>
+        <w:rPr>
+          <w:rFonts w:ascii="Times New Roman" w:eastAsia="MS Mincho" w:hAnsi="Times New Roman" w:cs="Times New Roman"/>
+          <w:kern w:val="0"/>
+          <w:sz w:val="22"/>
+          <w:szCs w:val="22"/>
+          <w:lang w:val="es-ES"/>
+          <w14:ligatures w14:val="none"/>
+        </w:rPr>
+      </w:pPr>
+      <w:hyperlink r:id="rId8" w:history="1">
+        <w:r>
+          <w:rPr>
+            <w:rStyle w:val="Hipervnculo"/>
+            <w:rFonts w:ascii="Times New Roman" w:eastAsia="MS Mincho" w:hAnsi="Times New Roman" w:cs="Times New Roman"/>
+            <w:kern w:val="0"/>
+            <w:sz w:val="22"/>
+            <w:szCs w:val="22"/>
+            <w14:ligatures w14:val="none"/>
+          </w:rPr>
+          <w:t xml:space="preserve">programacion-ii-2026/EXAMEN-PARCIAL-I at </w:t>
+        </w:r>
+        <w:proofErr w:type="spellStart"/>
+        <w:r>
+          <w:rPr>
+            <w:rStyle w:val="Hipervnculo"/>
+            <w:rFonts w:ascii="Times New Roman" w:eastAsia="MS Mincho" w:hAnsi="Times New Roman" w:cs="Times New Roman"/>
+            <w:kern w:val="0"/>
+            <w:sz w:val="22"/>
+            <w:szCs w:val="22"/>
+            <w14:ligatures w14:val="none"/>
+          </w:rPr>
+          <w:t>main</w:t>
+        </w:r>
+        <w:proofErr w:type="spellEnd"/>
+        <w:r>
+          <w:rPr>
+            <w:rStyle w:val="Hipervnculo"/>
+            <w:rFonts w:ascii="Times New Roman" w:eastAsia="MS Mincho" w:hAnsi="Times New Roman" w:cs="Times New Roman"/>
+            <w:kern w:val="0"/>
+            <w:sz w:val="22"/>
+            <w:szCs w:val="22"/>
+            <w14:ligatures w14:val="none"/>
+          </w:rPr>
+          <w:t xml:space="preserve"> · gloria-punay18/programacion-ii-2026</w:t>
+        </w:r>
+      </w:hyperlink>
     </w:p>
     <w:p>
       <w:pPr>
@@ -513,43 +623,7 @@
           <w:lang w:val="es-ES"/>
           <w14:ligatures w14:val="none"/>
         </w:rPr>
-        <w:t xml:space="preserve">Guatemala de la Asunción, </w:t>
-      </w:r>
-      <w:r>
-        <w:rPr>
-          <w:rFonts w:ascii="Times New Roman" w:eastAsia="MS Mincho" w:hAnsi="Times New Roman" w:cs="Times New Roman"/>
-          <w:kern w:val="0"/>
-          <w:lang w:val="es-ES"/>
-          <w14:ligatures w14:val="none"/>
-        </w:rPr>
-        <w:t>8</w:t>
-      </w:r>
-      <w:r>
-        <w:rPr>
-          <w:rFonts w:ascii="Times New Roman" w:eastAsia="MS Mincho" w:hAnsi="Times New Roman" w:cs="Times New Roman"/>
-          <w:kern w:val="0"/>
-          <w:lang w:val="es-ES"/>
-          <w14:ligatures w14:val="none"/>
-        </w:rPr>
-        <w:t xml:space="preserve"> de </w:t>
-      </w:r>
-      <w:r>
-        <w:rPr>
-          <w:rFonts w:ascii="Times New Roman" w:eastAsia="MS Mincho" w:hAnsi="Times New Roman" w:cs="Times New Roman"/>
-          <w:kern w:val="0"/>
-          <w:lang w:val="es-ES"/>
-          <w14:ligatures w14:val="none"/>
-        </w:rPr>
-        <w:t>agost</w:t>
-      </w:r>
-      <w:r>
-        <w:rPr>
-          <w:rFonts w:ascii="Times New Roman" w:eastAsia="MS Mincho" w:hAnsi="Times New Roman" w:cs="Times New Roman"/>
-          <w:kern w:val="0"/>
-          <w:lang w:val="es-ES"/>
-          <w14:ligatures w14:val="none"/>
-        </w:rPr>
-        <w:t>o de 2026</w:t>
+        <w:t>Guatemala de la Asunción, 8 de agosto de 2026</w:t>
       </w:r>
     </w:p>
     <w:p>
@@ -592,7 +666,6 @@
           <w:b/>
           <w:bCs/>
         </w:rPr>
-        <w:lastRenderedPageBreak/>
         <w:t>NOMBRE DEL PROYECTO:</w:t>
       </w:r>
       <w:r>
@@ -688,13 +761,7 @@
         <w:rPr>
           <w:rFonts w:ascii="Times New Roman" w:hAnsi="Times New Roman" w:cs="Times New Roman"/>
         </w:rPr>
-        <w:t xml:space="preserve"> </w:t>
-      </w:r>
-      <w:r>
-        <w:rPr>
-          <w:rFonts w:ascii="Times New Roman" w:hAnsi="Times New Roman" w:cs="Times New Roman"/>
-        </w:rPr>
-        <w:t>IntelliJ IDEA</w:t>
+        <w:t xml:space="preserve"> IntelliJ IDEA</w:t>
       </w:r>
     </w:p>
     <w:p>
@@ -747,6 +814,7 @@
       <w:r>
         <w:rPr>
           <w:rFonts w:ascii="Times New Roman" w:hAnsi="Times New Roman" w:cs="Times New Roman"/>
+          <w:noProof/>
         </w:rPr>
         <w:drawing>
           <wp:inline distT="0" distB="0" distL="0" distR="0" wp14:anchorId="4A01B0AE" wp14:editId="2414AFAD">
@@ -764,7 +832,7 @@
                     <pic:cNvPicPr/>
                   </pic:nvPicPr>
                   <pic:blipFill>
-                    <a:blip r:embed="rId8"/>
+                    <a:blip r:embed="rId9"/>
                     <a:stretch>
                       <a:fillRect/>
                     </a:stretch>
@@ -861,7 +929,6 @@
         <w:rPr>
           <w:rFonts w:ascii="Times New Roman" w:hAnsi="Times New Roman" w:cs="Times New Roman"/>
         </w:rPr>
-        <w:lastRenderedPageBreak/>
         <w:t xml:space="preserve">Cuenta Bloqueada por 3 intentos fallidos. </w:t>
       </w:r>
     </w:p>
@@ -892,7 +959,7 @@
                     <pic:cNvPicPr/>
                   </pic:nvPicPr>
                   <pic:blipFill>
-                    <a:blip r:embed="rId9"/>
+                    <a:blip r:embed="rId10"/>
                     <a:stretch>
                       <a:fillRect/>
                     </a:stretch>
@@ -950,6 +1017,7 @@
           <w:rFonts w:ascii="Times New Roman" w:hAnsi="Times New Roman" w:cs="Times New Roman"/>
           <w:noProof/>
         </w:rPr>
+        <w:lastRenderedPageBreak/>
         <w:drawing>
           <wp:inline distT="0" distB="0" distL="0" distR="0" wp14:anchorId="3176118F" wp14:editId="3C563AA3">
             <wp:extent cx="5612130" cy="3253105"/>
@@ -966,7 +1034,7 @@
                     <pic:cNvPicPr/>
                   </pic:nvPicPr>
                   <pic:blipFill>
-                    <a:blip r:embed="rId10"/>
+                    <a:blip r:embed="rId11"/>
                     <a:stretch>
                       <a:fillRect/>
                     </a:stretch>
@@ -1011,7 +1079,6 @@
         <w:rPr>
           <w:rFonts w:ascii="Times New Roman" w:hAnsi="Times New Roman" w:cs="Times New Roman"/>
         </w:rPr>
-        <w:lastRenderedPageBreak/>
         <w:t>Opción 1: Para consultar saldo.</w:t>
       </w:r>
     </w:p>
@@ -1042,7 +1109,7 @@
                     <pic:cNvPicPr/>
                   </pic:nvPicPr>
                   <pic:blipFill>
-                    <a:blip r:embed="rId11"/>
+                    <a:blip r:embed="rId12"/>
                     <a:stretch>
                       <a:fillRect/>
                     </a:stretch>
@@ -1106,6 +1173,7 @@
           <w:rFonts w:ascii="Times New Roman" w:hAnsi="Times New Roman" w:cs="Times New Roman"/>
           <w:noProof/>
         </w:rPr>
+        <w:lastRenderedPageBreak/>
         <w:drawing>
           <wp:inline distT="0" distB="0" distL="0" distR="0" wp14:anchorId="11BB6831" wp14:editId="612F64F6">
             <wp:extent cx="5612130" cy="3294380"/>
@@ -1122,7 +1190,7 @@
                     <pic:cNvPicPr/>
                   </pic:nvPicPr>
                   <pic:blipFill>
-                    <a:blip r:embed="rId12"/>
+                    <a:blip r:embed="rId13"/>
                     <a:stretch>
                       <a:fillRect/>
                     </a:stretch>
@@ -1167,7 +1235,6 @@
         <w:rPr>
           <w:rFonts w:ascii="Times New Roman" w:hAnsi="Times New Roman" w:cs="Times New Roman"/>
         </w:rPr>
-        <w:lastRenderedPageBreak/>
         <w:t xml:space="preserve">Opción 3: Para </w:t>
       </w:r>
       <w:r>
@@ -1204,7 +1271,7 @@
                     <pic:cNvPicPr/>
                   </pic:nvPicPr>
                   <pic:blipFill>
-                    <a:blip r:embed="rId13"/>
+                    <a:blip r:embed="rId14"/>
                     <a:stretch>
                       <a:fillRect/>
                     </a:stretch>
@@ -1242,31 +1309,21 @@
         <w:rPr>
           <w:rFonts w:ascii="Times New Roman" w:hAnsi="Times New Roman" w:cs="Times New Roman"/>
         </w:rPr>
-        <w:t> </w:t>
-      </w:r>
-      <w:r>
-        <w:rPr>
-          <w:rFonts w:ascii="Times New Roman" w:hAnsi="Times New Roman" w:cs="Times New Roman"/>
-        </w:rPr>
-        <w:t>R</w:t>
-      </w:r>
-      <w:r>
-        <w:rPr>
-          <w:rFonts w:ascii="Times New Roman" w:hAnsi="Times New Roman" w:cs="Times New Roman"/>
-        </w:rPr>
-        <w:t>etiro rechazado</w:t>
-      </w:r>
-    </w:p>
-    <w:p>
-      <w:pPr>
-        <w:rPr>
-          <w:rFonts w:ascii="Times New Roman" w:hAnsi="Times New Roman" w:cs="Times New Roman"/>
-        </w:rPr>
-      </w:pPr>
-      <w:r>
-        <w:rPr>
-          <w:rFonts w:ascii="Times New Roman" w:hAnsi="Times New Roman" w:cs="Times New Roman"/>
-        </w:rPr>
+        <w:t> Retiro rechazado</w:t>
+      </w:r>
+    </w:p>
+    <w:p>
+      <w:pPr>
+        <w:rPr>
+          <w:rFonts w:ascii="Times New Roman" w:hAnsi="Times New Roman" w:cs="Times New Roman"/>
+        </w:rPr>
+      </w:pPr>
+      <w:r>
+        <w:rPr>
+          <w:rFonts w:ascii="Times New Roman" w:hAnsi="Times New Roman" w:cs="Times New Roman"/>
+          <w:noProof/>
+        </w:rPr>
+        <w:lastRenderedPageBreak/>
         <w:drawing>
           <wp:inline distT="0" distB="0" distL="0" distR="0" wp14:anchorId="23A74918" wp14:editId="3D3CACEA">
             <wp:extent cx="5612130" cy="3262630"/>
@@ -1283,7 +1340,7 @@
                     <pic:cNvPicPr/>
                   </pic:nvPicPr>
                   <pic:blipFill>
-                    <a:blip r:embed="rId14"/>
+                    <a:blip r:embed="rId15"/>
                     <a:stretch>
                       <a:fillRect/>
                     </a:stretch>
@@ -1328,7 +1385,6 @@
         <w:rPr>
           <w:rFonts w:ascii="Times New Roman" w:hAnsi="Times New Roman" w:cs="Times New Roman"/>
         </w:rPr>
-        <w:lastRenderedPageBreak/>
         <w:t xml:space="preserve">Opción 4: Para </w:t>
       </w:r>
       <w:r>
@@ -1365,7 +1421,7 @@
                     <pic:cNvPicPr/>
                   </pic:nvPicPr>
                   <pic:blipFill>
-                    <a:blip r:embed="rId15"/>
+                    <a:blip r:embed="rId16"/>
                     <a:stretch>
                       <a:fillRect/>
                     </a:stretch>
@@ -1417,6 +1473,7 @@
           <w:rFonts w:ascii="Times New Roman" w:hAnsi="Times New Roman" w:cs="Times New Roman"/>
           <w:noProof/>
         </w:rPr>
+        <w:lastRenderedPageBreak/>
         <w:drawing>
           <wp:inline distT="0" distB="0" distL="0" distR="0" wp14:anchorId="5CCD0D3D" wp14:editId="0E8AB274">
             <wp:extent cx="5612130" cy="3224530"/>
@@ -1433,7 +1490,7 @@
                     <pic:cNvPicPr/>
                   </pic:nvPicPr>
                   <pic:blipFill>
-                    <a:blip r:embed="rId16"/>
+                    <a:blip r:embed="rId17"/>
                     <a:stretch>
                       <a:fillRect/>
                     </a:stretch>
@@ -1478,7 +1535,6 @@
         <w:rPr>
           <w:rFonts w:ascii="Times New Roman" w:hAnsi="Times New Roman" w:cs="Times New Roman"/>
         </w:rPr>
-        <w:lastRenderedPageBreak/>
         <w:t>Opción 6: Salir</w:t>
       </w:r>
     </w:p>
@@ -1509,7 +1565,7 @@
                     <pic:cNvPicPr/>
                   </pic:nvPicPr>
                   <pic:blipFill>
-                    <a:blip r:embed="rId17"/>
+                    <a:blip r:embed="rId18"/>
                     <a:stretch>
                       <a:fillRect/>
                     </a:stretch>
@@ -1650,7 +1706,6 @@
           <w:b/>
           <w:bCs/>
         </w:rPr>
-        <w:lastRenderedPageBreak/>
         <w:t>EVIDENCIA DE SOBRECARGA</w:t>
       </w:r>
     </w:p>
@@ -1673,6 +1728,7 @@
       <w:r>
         <w:rPr>
           <w:rFonts w:ascii="Times New Roman" w:hAnsi="Times New Roman" w:cs="Times New Roman"/>
+          <w:noProof/>
           <w:lang w:val="es-ES"/>
         </w:rPr>
         <w:drawing>
@@ -1691,7 +1747,7 @@
                     <pic:cNvPicPr/>
                   </pic:nvPicPr>
                   <pic:blipFill>
-                    <a:blip r:embed="rId18"/>
+                    <a:blip r:embed="rId19"/>
                     <a:stretch>
                       <a:fillRect/>
                     </a:stretch>
@@ -1732,8 +1788,10 @@
       <w:r>
         <w:rPr>
           <w:rFonts w:ascii="Times New Roman" w:hAnsi="Times New Roman" w:cs="Times New Roman"/>
-          <w:lang w:val="es-ES"/>
-        </w:rPr>
+          <w:noProof/>
+          <w:lang w:val="es-ES"/>
+        </w:rPr>
+        <w:lastRenderedPageBreak/>
         <w:drawing>
           <wp:inline distT="0" distB="0" distL="0" distR="0" wp14:anchorId="7EB02F4C" wp14:editId="385F3299">
             <wp:extent cx="5486400" cy="4154840"/>
@@ -1750,7 +1808,7 @@
                     <pic:cNvPicPr/>
                   </pic:nvPicPr>
                   <pic:blipFill>
-                    <a:blip r:embed="rId19"/>
+                    <a:blip r:embed="rId20"/>
                     <a:stretch>
                       <a:fillRect/>
                     </a:stretch>
@@ -3139,6 +3197,29 @@
     <w:uiPriority w:val="99"/>
     <w:rsid w:val="00626310"/>
   </w:style>
+  <w:style w:type="character" w:styleId="Hipervnculo">
+    <w:name w:val="Hyperlink"/>
+    <w:basedOn w:val="Fuentedeprrafopredeter"/>
+    <w:uiPriority w:val="99"/>
+    <w:unhideWhenUsed/>
+    <w:rsid w:val="00D82B83"/>
+    <w:rPr>
+      <w:color w:val="467886" w:themeColor="hyperlink"/>
+      <w:u w:val="single"/>
+    </w:rPr>
+  </w:style>
+  <w:style w:type="character" w:styleId="Mencinsinresolver">
+    <w:name w:val="Unresolved Mention"/>
+    <w:basedOn w:val="Fuentedeprrafopredeter"/>
+    <w:uiPriority w:val="99"/>
+    <w:semiHidden/>
+    <w:unhideWhenUsed/>
+    <w:rsid w:val="00D82B83"/>
+    <w:rPr>
+      <w:color w:val="605E5C"/>
+      <w:shd w:val="clear" w:color="auto" w:fill="E1DFDD"/>
+    </w:rPr>
+  </w:style>
 </w:styles>
 </file>
 

</xml_diff>